<commit_message>
fix: resolve SuperAdminDashboard useEffect import runtime error and update Master Blueprint Word document manual
</commit_message>
<xml_diff>
--- a/PHARMDVERSE_ERP_COMPLETE_BLUEPRINT_AND_USER_MANUAL.docx
+++ b/PHARMDVERSE_ERP_COMPLETE_BLUEPRINT_AND_USER_MANUAL.docx
@@ -1702,7 +1702,7 @@
           <w:color w:val="0D9488"/>
           <w:sz w:val="28"/>
         </w:rPr>
-        <w:t>3. Clinical Master Data Center</w:t>
+        <w:t>3. Clinical Master Data Center (All 5 Modules)</w:t>
       </w:r>
     </w:p>
     <w:p>
@@ -1717,7 +1717,7 @@
           <w:color w:val="0F172A"/>
           <w:sz w:val="21"/>
         </w:rPr>
-        <w:t xml:space="preserve">Drug Knowledge Master: </w:t>
+        <w:t xml:space="preserve">1. Drug Knowledge Master: </w:t>
       </w:r>
       <w:r>
         <w:rPr>
@@ -1740,7 +1740,7 @@
           <w:color w:val="0F172A"/>
           <w:sz w:val="21"/>
         </w:rPr>
-        <w:t xml:space="preserve">Lab Parameter Master: </w:t>
+        <w:t xml:space="preserve">2. Lab Parameter Master: </w:t>
       </w:r>
       <w:r>
         <w:rPr>
@@ -1763,7 +1763,7 @@
           <w:color w:val="0F172A"/>
           <w:sz w:val="21"/>
         </w:rPr>
-        <w:t xml:space="preserve">Drug–Drug Interaction (DDI) Master: </w:t>
+        <w:t xml:space="preserve">3. Other Investigation Master: </w:t>
       </w:r>
       <w:r>
         <w:rPr>
@@ -1771,7 +1771,7 @@
           <w:color w:val="1E293B"/>
           <w:sz w:val="21"/>
         </w:rPr>
-        <w:t>Maintain pairwise DDI severity categories (Major, Moderate, Minor) and clinical mechanism warnings.</w:t>
+        <w:t>Manage non-lab diagnostic tests, clinical imaging categories, radiological procedures, and diagnostic investigation codes.</w:t>
       </w:r>
     </w:p>
     <w:p>
@@ -1786,7 +1786,7 @@
           <w:color w:val="0F172A"/>
           <w:sz w:val="21"/>
         </w:rPr>
-        <w:t xml:space="preserve">Drug–Food Interaction (DFI) Master: </w:t>
+        <w:t xml:space="preserve">4. Drug–Drug Interaction (DDI) Master: </w:t>
       </w:r>
       <w:r>
         <w:rPr>
@@ -1794,7 +1794,30 @@
           <w:color w:val="1E293B"/>
           <w:sz w:val="21"/>
         </w:rPr>
-        <w:t>Manage dietary administration rules, meal timing instructions, and food restrictions.</w:t>
+        <w:t>Maintain pairwise DDI severity categories (Major, Severe, Critical, Moderate, Minor) and clinical mechanism warnings.</w:t>
+      </w:r>
+    </w:p>
+    <w:p>
+      <w:pPr>
+        <w:pStyle w:val="ListBullet"/>
+        <w:spacing w:after="80" w:line="276" w:lineRule="auto"/>
+      </w:pPr>
+      <w:r>
+        <w:rPr>
+          <w:rFonts w:ascii="Arial" w:hAnsi="Arial"/>
+          <w:b/>
+          <w:color w:val="0F172A"/>
+          <w:sz w:val="21"/>
+        </w:rPr>
+        <w:t xml:space="preserve">5. Drug–Food Interaction (DFI) Master: </w:t>
+      </w:r>
+      <w:r>
+        <w:rPr>
+          <w:rFonts w:ascii="Arial" w:hAnsi="Arial"/>
+          <w:color w:val="1E293B"/>
+          <w:sz w:val="21"/>
+        </w:rPr>
+        <w:t>Manage dietary administration rules, meal timing instructions, alcohol/grapefruit juice warnings, and food precautions.</w:t>
       </w:r>
     </w:p>
     <w:p>
@@ -1808,20 +1831,53 @@
           <w:color w:val="0D9488"/>
           <w:sz w:val="28"/>
         </w:rPr>
-        <w:t>4. Platform Settings &amp; Branding</w:t>
+        <w:t>4. Platform Settings vs My Profile &amp; Security</w:t>
       </w:r>
     </w:p>
     <w:p>
       <w:pPr>
-        <w:spacing w:after="120" w:line="276" w:lineRule="auto"/>
+        <w:pStyle w:val="ListBullet"/>
+        <w:spacing w:after="80" w:line="276" w:lineRule="auto"/>
       </w:pPr>
+      <w:r>
+        <w:rPr>
+          <w:rFonts w:ascii="Arial" w:hAnsi="Arial"/>
+          <w:b/>
+          <w:color w:val="0F172A"/>
+          <w:sz w:val="21"/>
+        </w:rPr>
+        <w:t xml:space="preserve">A. Platform Settings: </w:t>
+      </w:r>
       <w:r>
         <w:rPr>
           <w:rFonts w:ascii="Arial" w:hAnsi="Arial"/>
           <w:color w:val="1E293B"/>
           <w:sz w:val="21"/>
         </w:rPr>
-        <w:t>Configures global platform branding (PharmDVerse ERP logo, tagline, version number) and security settings.</w:t>
+        <w:t>Configures platform-wide identity and landing environment in PlatformSettingsManagementView.jsx: Platform Name ('PharmDVerse ERP'), System Tagline, Support Contact Email, Platform Logo URL, Favicon URL, and Footer Text.</w:t>
+      </w:r>
+    </w:p>
+    <w:p>
+      <w:pPr>
+        <w:pStyle w:val="ListBullet"/>
+        <w:spacing w:after="80" w:line="276" w:lineRule="auto"/>
+      </w:pPr>
+      <w:r>
+        <w:rPr>
+          <w:rFonts w:ascii="Arial" w:hAnsi="Arial"/>
+          <w:b/>
+          <w:color w:val="0F172A"/>
+          <w:sz w:val="21"/>
+        </w:rPr>
+        <w:t xml:space="preserve">B. My Profile &amp; Security: </w:t>
+      </w:r>
+      <w:r>
+        <w:rPr>
+          <w:rFonts w:ascii="Arial" w:hAnsi="Arial"/>
+          <w:color w:val="1E293B"/>
+          <w:sz w:val="21"/>
+        </w:rPr>
+        <w:t>Manages Super Admin administrative account security in SuperAdminProfileView.jsx: Admin Name, Primary Email, Last Login timestamp, Account Created Date, Password Change form (Current, New, Confirm Password with visibility toggles), and active session invalidation options.</w:t>
       </w:r>
     </w:p>
     <w:p>
@@ -2208,7 +2264,7 @@
           <w:color w:val="1E293B"/>
           <w:sz w:val="21"/>
         </w:rPr>
-        <w:t>Export signed, college-branded vector PDFs or PPT presentations.</w:t>
+        <w:t>Export signed, college-branded PDF/PPT documents featuring institutional headers and signature anchors.</w:t>
       </w:r>
     </w:p>
     <w:p>
@@ -2391,7 +2447,7 @@
           <w:color w:val="1E293B"/>
           <w:sz w:val="21"/>
         </w:rPr>
-        <w:t>Generates a comprehensive 10-part clinical evaluation (Sections 3 through 6D) synthesizing indication alignment, dosing safety, lab toxicity risks, DDI/DFI matrices, ADR causality, counselling completeness, DTP intervention logic, DIR literature review, an Overall Summary paragraph, and a Red Caution Educational Disclaimer.</w:t>
+        <w:t>Provides a complete clinical evaluation covering Sections 3 through 6D, followed by the Overall Clinical Case Analysis Summary, Educational Disclaimer, and AI Analysis PDF.</w:t>
       </w:r>
     </w:p>
     <w:p>
@@ -3383,7 +3439,7 @@
           <w:color w:val="1E293B"/>
           <w:sz w:val="21"/>
         </w:rPr>
-        <w:t>The AI Clinical Case Analysis engine delivers structured, evidence-based synthesis of case logbooks:</w:t>
+        <w:t>The AI Clinical Case Analysis engine delivers a complete clinical evaluation covering Sections 3 through 6D, followed by the Overall Clinical Case Analysis Summary, Educational Disclaimer, and AI Analysis PDF:</w:t>
       </w:r>
     </w:p>
     <w:p>
@@ -3475,7 +3531,7 @@
           <w:color w:val="1E293B"/>
           <w:sz w:val="21"/>
         </w:rPr>
-        <w:t>Drug–Drug Interaction (DDI) Matrix (Pairwise DDI severity evaluation).</w:t>
+        <w:t>Drug–Drug Interaction (DDI) Matrix (Pairwise DDI severity: Major, Severe, Critical, Moderate, Minor).</w:t>
       </w:r>
     </w:p>
     <w:p>
@@ -3613,7 +3669,7 @@
           <w:color w:val="1E293B"/>
           <w:sz w:val="21"/>
         </w:rPr>
-        <w:t>ONE short, clear synthesis paragraph of overall case findings.</w:t>
+        <w:t>ONE short, clear synthesis paragraph summarizing overall case findings.</w:t>
       </w:r>
     </w:p>
     <w:tbl>
@@ -3674,6 +3730,33 @@
     </w:p>
     <w:p>
       <w:pPr>
+        <w:spacing w:before="280" w:after="120"/>
+      </w:pPr>
+      <w:r>
+        <w:rPr>
+          <w:rFonts w:ascii="Arial" w:hAnsi="Arial"/>
+          <w:b/>
+          <w:color w:val="0D9488"/>
+          <w:sz w:val="28"/>
+        </w:rPr>
+        <w:t>AI Analysis PDF Output</w:t>
+      </w:r>
+    </w:p>
+    <w:p>
+      <w:pPr>
+        <w:spacing w:after="120" w:line="276" w:lineRule="auto"/>
+      </w:pPr>
+      <w:r>
+        <w:rPr>
+          <w:rFonts w:ascii="Arial" w:hAnsi="Arial"/>
+          <w:color w:val="1E293B"/>
+          <w:sz w:val="21"/>
+        </w:rPr>
+        <w:t>The AI Clinical Case Analysis view provides a direct 'Download AI Analysis PDF' action (a direct PDF download action, not a separate 'Save Analysis' feature). The generated AI Analysis PDF automatically follows the respective college's existing document branding/template configuration (logos, header, watermark, footer, and signature blocks) and prominently retains the Educational Disclaimer.</w:t>
+      </w:r>
+    </w:p>
+    <w:p>
+      <w:pPr>
         <w:spacing w:before="400" w:after="160"/>
       </w:pPr>
       <w:r>
@@ -3696,7 +3779,7 @@
           <w:color w:val="1E293B"/>
           <w:sz w:val="21"/>
         </w:rPr>
-        <w:t>Pre-Submission Review serves strictly as a Pre-Flight Validation Gatekeeper before case submission. It checks for saved form statuses, required demographics, chief complaints, diagnosis, vitals, lab parameters, and prescribed drugs without modifying patient data or acting as a clinical engine.</w:t>
+        <w:t>Pre-Submission Review serves strictly as a documentation pre-flight validation gatekeeper before case submission. It identifies required fields, missing fields/information, incomplete documentation, form completion/saved status, 'Correction Required' alerts, 'Please Verify' notices, 'Documentation Gap' warnings, and provides direct Review Field navigation back to relevant form fields. It does not perform Master Data analysis, AI analysis, or act as a clinical decision engine.</w:t>
       </w:r>
     </w:p>
     <w:p>
@@ -3792,7 +3875,7 @@
           <w:color w:val="1E293B"/>
           <w:sz w:val="21"/>
         </w:rPr>
-        <w:t>Non-lab diagnostic tests, procedures, imaging categories.</w:t>
+        <w:t>Non-lab diagnostic tests, clinical imaging categories, radiological procedures, diagnostic codes.</w:t>
       </w:r>
     </w:p>
     <w:p>
@@ -3815,7 +3898,7 @@
           <w:color w:val="1E293B"/>
           <w:sz w:val="21"/>
         </w:rPr>
-        <w:t>Pairwise interaction pairs, severity ratings (Major, Moderate, Minor), mechanisms.</w:t>
+        <w:t>Pairwise interaction pairs, severity ratings (Major, Severe, Critical, Moderate, Minor), clinical mechanisms.</w:t>
       </w:r>
     </w:p>
     <w:p>
@@ -3838,7 +3921,7 @@
           <w:color w:val="1E293B"/>
           <w:sz w:val="21"/>
         </w:rPr>
-        <w:t>Food interaction rules, administration timing, dietary restrictions.</w:t>
+        <w:t>Food interaction rules, administration timing, dietary restrictions, alcohol/grapefruit warnings.</w:t>
       </w:r>
     </w:p>
     <w:p>
@@ -3925,7 +4008,7 @@
           <w:color w:val="0F172A"/>
           <w:sz w:val="36"/>
         </w:rPr>
-        <w:t>PART XI — NOTIFICATIONS &amp; WORKFLOW STATUS</w:t>
+        <w:t>PART XI — NOTIFICATIONS &amp; STATUS WORKFLOW</w:t>
       </w:r>
     </w:p>
     <w:p>
@@ -3938,7 +4021,66 @@
           <w:color w:val="1E293B"/>
           <w:sz w:val="21"/>
         </w:rPr>
-        <w:t>Workflow status transitions (Draft → Submitted → Preceptor Review → Approved / Returned for Revision) update database state records and trigger notification alerts for assigned students and preceptors.</w:t>
+        <w:t>Implemented workflow notification events in public.notifications:</w:t>
+      </w:r>
+    </w:p>
+    <w:p>
+      <w:pPr>
+        <w:pStyle w:val="ListBullet"/>
+        <w:spacing w:after="80" w:line="276" w:lineRule="auto"/>
+      </w:pPr>
+      <w:r>
+        <w:rPr>
+          <w:rFonts w:ascii="Arial" w:hAnsi="Arial"/>
+          <w:b/>
+          <w:color w:val="0F172A"/>
+          <w:sz w:val="21"/>
+        </w:rPr>
+        <w:t xml:space="preserve">Case Logbook Submission: </w:t>
+      </w:r>
+      <w:r>
+        <w:rPr>
+          <w:rFonts w:ascii="Arial" w:hAnsi="Arial"/>
+          <w:color w:val="1E293B"/>
+          <w:sz w:val="21"/>
+        </w:rPr>
+        <w:t>Case submission by a student inserts a notification record for the assigned Preceptor (recipient_role: 'Preceptor').</w:t>
+      </w:r>
+    </w:p>
+    <w:p>
+      <w:pPr>
+        <w:pStyle w:val="ListBullet"/>
+        <w:spacing w:after="80" w:line="276" w:lineRule="auto"/>
+      </w:pPr>
+      <w:r>
+        <w:rPr>
+          <w:rFonts w:ascii="Arial" w:hAnsi="Arial"/>
+          <w:b/>
+          <w:color w:val="0F172A"/>
+          <w:sz w:val="21"/>
+        </w:rPr>
+        <w:t xml:space="preserve">Preceptor Decision: </w:t>
+      </w:r>
+      <w:r>
+        <w:rPr>
+          <w:rFonts w:ascii="Arial" w:hAnsi="Arial"/>
+          <w:color w:val="1E293B"/>
+          <w:sz w:val="21"/>
+        </w:rPr>
+        <w:t>Case approval or revision request by a preceptor inserts a notification record for the student (recipient_role: 'Student').</w:t>
+      </w:r>
+    </w:p>
+    <w:p>
+      <w:pPr>
+        <w:spacing w:after="120" w:line="276" w:lineRule="auto"/>
+      </w:pPr>
+      <w:r>
+        <w:rPr>
+          <w:rFonts w:ascii="Arial" w:hAnsi="Arial"/>
+          <w:color w:val="1E293B"/>
+          <w:sz w:val="21"/>
+        </w:rPr>
+        <w:t>Notifications feature 60-second deduplication guards, unread counter badges, and role-based action routes.</w:t>
       </w:r>
     </w:p>
     <w:p>
@@ -4206,7 +4348,7 @@
           <w:color w:val="0F172A"/>
           <w:sz w:val="21"/>
         </w:rPr>
-        <w:t xml:space="preserve">Backend Stack: </w:t>
+        <w:t xml:space="preserve">Authentication Architecture: </w:t>
       </w:r>
       <w:r>
         <w:rPr>
@@ -4214,7 +4356,7 @@
           <w:color w:val="1E293B"/>
           <w:sz w:val="21"/>
         </w:rPr>
-        <w:t>Supabase PostgreSQL, Supabase Auth, Row-Level Security (RLS).</w:t>
+        <w:t>Database-backed super_admin authentication via authService.js for Super Admins; Supabase Auth (supabase.auth) for College Admins, Preceptors, and Students with Row-Level Security (RLS) and college_id isolation.</w:t>
       </w:r>
     </w:p>
     <w:p>
@@ -4264,7 +4406,7 @@
           <w:color w:val="1E293B"/>
           <w:sz w:val="21"/>
         </w:rPr>
-        <w:t>LANDING PAGE ──► AUTHENTICATION ──► ROLE PORTAL (Super Admin / College Admin / Preceptor / Student) ──► CLINICAL MODULES ──► AI CASE ANALYSIS (Sec 3–6D + Summary) ──► PRE-SUBMISSION REVIEW ──► PRECEPTOR REVIEW ──► COLLEGE-BRANDED PDF/PPT EXPORT</w:t>
+        <w:t>LANDING PAGE ──► AUTHENTICATION (Database / Supabase Auth) ──► ROLE PORTAL (Super Admin / College Admin / Preceptor / Student) ──► CLINICAL MODULES ──► AI CASE ANALYSIS (Sec 3–6D + Summary) ──► PRE-SUBMISSION REVIEW ──► PRECEPTOR REVIEW ──► COLLEGE-BRANDED PDF/PPT EXPORT</w:t>
       </w:r>
     </w:p>
     <w:sectPr>

</xml_diff>